<commit_message>
Update CV template to match refreshed master CV
- Drop the static "Independent Software Engineer / Product Development"
  work-experience role
- Retitle Calvergy role to "Software Engineer (Intern)"
- Add a new "Current Projects" section (JobVault, Demand Forecasting
  System) replacing the old GlobalPost project entries
- Add a new "Additional Employment" section (MyLogistics GmbH, part-time)
- Reorder sections to match the new master CV: Work Experience -> Current
  Projects -> Additional Employment -> Education -> Certifications ->
  Languages
- Update certifications/languages copy and header contact line
- Regenerate templates/cv_template.docx from the updated build script
- Update README to reflect the new fixed template structure

Dynamic tags (headline, summary, skills, and the 4 employer bullet loops)
are unchanged, so the Worker payload contract is unaffected.

Co-Authored-By: Claude Sonnet 5 <noreply@anthropic.com>
</commit_message>
<xml_diff>
--- a/templates/cv_template.docx
+++ b/templates/cv_template.docx
@@ -46,7 +46,7 @@
           <w:sz w:val="20"/>
           <w:szCs w:val="20"/>
         </w:rPr>
-        <w:t xml:space="preserve">Raunheim, Germany  |  +49 1521 5678891  |  mbilaluddin1994@gmail.com</w:t>
+        <w:t xml:space="preserve">Germany  |  +49 1521 5678891  |  mbilaluddin1994@gmail.com</w:t>
       </w:r>
     </w:p>
     <w:p>
@@ -54,7 +54,7 @@
         <w:spacing w:after="0" w:before="0"/>
         <w:jc w:val="center"/>
       </w:pPr>
-      <w:hyperlink w:history="1" r:id="rIdww_p6ys0d3adpbrj4wg3s">
+      <w:hyperlink w:history="1" r:id="rIdxmkxohit6z8i2jkv2vysg">
         <w:r>
           <w:rPr>
             <w:rFonts w:ascii="Calibri" w:cs="Calibri" w:eastAsia="Calibri" w:hAnsi="Calibri"/>
@@ -75,7 +75,7 @@
         </w:rPr>
         <w:t xml:space="preserve">  |  </w:t>
       </w:r>
-      <w:hyperlink w:history="1" r:id="rIdekzwmxd684ojbjmzrby4i">
+      <w:hyperlink w:history="1" r:id="rId8x_u1j-twjidmlbebzvfo">
         <w:r>
           <w:rPr>
             <w:rFonts w:ascii="Calibri" w:cs="Calibri" w:eastAsia="Calibri" w:hAnsi="Calibri"/>
@@ -297,137 +297,7 @@
           <w:sz w:val="20"/>
           <w:szCs w:val="20"/>
         </w:rPr>
-        <w:t xml:space="preserve">Independent Software Engineer / Product Development</w:t>
-      </w:r>
-      <w:r>
-        <w:t xml:space="preserve">	</w:t>
-      </w:r>
-      <w:r>
-        <w:rPr>
-          <w:rFonts w:ascii="Calibri" w:cs="Calibri" w:eastAsia="Calibri" w:hAnsi="Calibri"/>
-          <w:b/>
-          <w:bCs/>
-          <w:color w:val="000000"/>
-          <w:sz w:val="20"/>
-          <w:szCs w:val="20"/>
-        </w:rPr>
-        <w:t xml:space="preserve">01/2026 – Present</w:t>
-      </w:r>
-    </w:p>
-    <w:p>
-      <w:pPr>
-        <w:keepNext/>
-        <w:spacing w:after="60" w:before="0"/>
-      </w:pPr>
-      <w:r>
-        <w:rPr>
-          <w:rFonts w:ascii="Calibri" w:cs="Calibri" w:eastAsia="Calibri" w:hAnsi="Calibri"/>
-          <w:b/>
-          <w:bCs/>
-          <w:color w:val="000000"/>
-          <w:sz w:val="20"/>
-          <w:szCs w:val="20"/>
-        </w:rPr>
-        <w:t xml:space="preserve">Self-Employed</w:t>
-      </w:r>
-      <w:r>
-        <w:rPr>
-          <w:rFonts w:ascii="Calibri" w:cs="Calibri" w:eastAsia="Calibri" w:hAnsi="Calibri"/>
-          <w:color w:val="000000"/>
-          <w:sz w:val="20"/>
-          <w:szCs w:val="20"/>
-        </w:rPr>
-        <w:t xml:space="preserve">  –  Remote</w:t>
-      </w:r>
-    </w:p>
-    <w:p>
-      <w:pPr>
-        <w:pStyle w:val="ListParagraph"/>
-        <w:numPr>
-          <w:ilvl w:val="0"/>
-          <w:numId w:val="2"/>
-        </w:numPr>
-        <w:spacing w:after="20" w:before="20"/>
-      </w:pPr>
-      <w:r>
-        <w:rPr>
-          <w:rFonts w:ascii="Calibri" w:cs="Calibri" w:eastAsia="Calibri" w:hAnsi="Calibri"/>
-          <w:color w:val="333333"/>
-          <w:sz w:val="20"/>
-          <w:szCs w:val="20"/>
-        </w:rPr>
-        <w:t xml:space="preserve">Architected and built JobVault, a self-hosted AI-driven job application platform (.NET 9, Vue 3, MongoDB) where a Claude-powered agent evaluates job postings and generates tailored CVs/cover letters from a curated experience library</w:t>
-      </w:r>
-    </w:p>
-    <w:p>
-      <w:pPr>
-        <w:pStyle w:val="ListParagraph"/>
-        <w:numPr>
-          <w:ilvl w:val="0"/>
-          <w:numId w:val="2"/>
-        </w:numPr>
-        <w:spacing w:after="20" w:before="20"/>
-      </w:pPr>
-      <w:r>
-        <w:rPr>
-          <w:rFonts w:ascii="Calibri" w:cs="Calibri" w:eastAsia="Calibri" w:hAnsi="Calibri"/>
-          <w:color w:val="333333"/>
-          <w:sz w:val="20"/>
-          <w:szCs w:val="20"/>
-        </w:rPr>
-        <w:t xml:space="preserve">Built an event-driven pipeline (RabbitMQ, Worker service) generating DOCX/PDF documents and committing them atomically to a GitHub-based document vault via the Git Trees API, with dead-letter retry handling</w:t>
-      </w:r>
-    </w:p>
-    <w:p>
-      <w:pPr>
-        <w:pStyle w:val="ListParagraph"/>
-        <w:numPr>
-          <w:ilvl w:val="0"/>
-          <w:numId w:val="2"/>
-        </w:numPr>
-        <w:spacing w:after="20" w:before="20"/>
-      </w:pPr>
-      <w:r>
-        <w:rPr>
-          <w:rFonts w:ascii="Calibri" w:cs="Calibri" w:eastAsia="Calibri" w:hAnsi="Calibri"/>
-          <w:color w:val="333333"/>
-          <w:sz w:val="20"/>
-          <w:szCs w:val="20"/>
-        </w:rPr>
-        <w:t xml:space="preserve">Deployed via GitHub Actions CI/CD and Cloudflare Tunnel, sustaining 11ms average response time at 0% error rate under load testing</w:t>
-      </w:r>
-    </w:p>
-    <w:p>
-      <w:pPr>
-        <w:spacing w:after="0" w:before="80"/>
-      </w:pPr>
-      <w:r>
-        <w:rPr>
-          <w:rFonts w:ascii="Calibri" w:cs="Calibri" w:eastAsia="Calibri" w:hAnsi="Calibri"/>
-          <w:sz w:val="20"/>
-          <w:szCs w:val="20"/>
-        </w:rPr>
-        <w:t xml:space="preserve"/>
-      </w:r>
-    </w:p>
-    <w:p>
-      <w:pPr>
-        <w:keepNext/>
-        <w:tabs>
-          <w:tab w:val="right" w:pos="10772"/>
-        </w:tabs>
-        <w:spacing w:after="0" w:before="140"/>
-      </w:pPr>
-      <w:r>
-        <w:rPr>
-          <w:rFonts w:ascii="Calibri" w:cs="Calibri" w:eastAsia="Calibri" w:hAnsi="Calibri"/>
-          <w:b/>
-          <w:bCs/>
-          <w:color w:val="2E75B6"/>
-          <w:sz w:val="20"/>
-          <w:szCs w:val="20"/>
-        </w:rPr>
-        <w:t xml:space="preserve">Software Engineer</w:t>
+        <w:t xml:space="preserve">Software Engineer (Intern)</w:t>
       </w:r>
       <w:r>
         <w:t xml:space="preserve">	</w:t>
@@ -920,15 +790,13 @@
           <w:sz w:val="26"/>
           <w:szCs w:val="26"/>
         </w:rPr>
-        <w:t xml:space="preserve">Education</w:t>
-      </w:r>
-    </w:p>
-    <w:p>
-      <w:pPr>
-        <w:tabs>
-          <w:tab w:val="right" w:pos="10772"/>
-        </w:tabs>
-        <w:spacing w:after="20" w:before="60"/>
+        <w:t xml:space="preserve">Current Projects</w:t>
+      </w:r>
+    </w:p>
+    <w:p>
+      <w:pPr>
+        <w:keepNext/>
+        <w:spacing w:after="0" w:before="100"/>
       </w:pPr>
       <w:r>
         <w:rPr>
@@ -939,149 +807,25 @@
           <w:sz w:val="20"/>
           <w:szCs w:val="20"/>
         </w:rPr>
-        <w:t xml:space="preserve">MSCS in </w:t>
-      </w:r>
-      <w:r>
-        <w:rPr>
-          <w:rFonts w:ascii="Calibri" w:cs="Calibri" w:eastAsia="Calibri" w:hAnsi="Calibri"/>
-          <w:b/>
-          <w:bCs/>
-          <w:color w:val="2E75B6"/>
-          <w:sz w:val="20"/>
-          <w:szCs w:val="20"/>
-        </w:rPr>
-        <w:t xml:space="preserve">Computer Science</w:t>
-      </w:r>
-      <w:r>
-        <w:rPr>
-          <w:rFonts w:ascii="Calibri" w:cs="Calibri" w:eastAsia="Calibri" w:hAnsi="Calibri"/>
-          <w:color w:val="000000"/>
-          <w:sz w:val="20"/>
-          <w:szCs w:val="20"/>
-        </w:rPr>
-        <w:t xml:space="preserve"> – Bahria University, Karachi</w:t>
-      </w:r>
-      <w:r>
-        <w:t xml:space="preserve">	</w:t>
-      </w:r>
-      <w:r>
-        <w:rPr>
-          <w:rFonts w:ascii="Calibri" w:cs="Calibri" w:eastAsia="Calibri" w:hAnsi="Calibri"/>
-          <w:b/>
-          <w:bCs/>
-          <w:color w:val="000000"/>
-          <w:sz w:val="20"/>
-          <w:szCs w:val="20"/>
-        </w:rPr>
-        <w:t xml:space="preserve">03/2021 – 01/2023</w:t>
-      </w:r>
-    </w:p>
-    <w:p>
-      <w:pPr>
-        <w:tabs>
-          <w:tab w:val="right" w:pos="10772"/>
-        </w:tabs>
-        <w:spacing w:after="20" w:before="60"/>
-      </w:pPr>
-      <w:r>
-        <w:rPr>
-          <w:rFonts w:ascii="Calibri" w:cs="Calibri" w:eastAsia="Calibri" w:hAnsi="Calibri"/>
-          <w:b/>
-          <w:bCs/>
-          <w:color w:val="2E75B6"/>
-          <w:sz w:val="20"/>
-          <w:szCs w:val="20"/>
-        </w:rPr>
-        <w:t xml:space="preserve">BSCS in </w:t>
-      </w:r>
-      <w:r>
-        <w:rPr>
-          <w:rFonts w:ascii="Calibri" w:cs="Calibri" w:eastAsia="Calibri" w:hAnsi="Calibri"/>
-          <w:b/>
-          <w:bCs/>
-          <w:color w:val="2E75B6"/>
-          <w:sz w:val="20"/>
-          <w:szCs w:val="20"/>
-        </w:rPr>
-        <w:t xml:space="preserve">Computer Science</w:t>
-      </w:r>
-      <w:r>
-        <w:rPr>
-          <w:rFonts w:ascii="Calibri" w:cs="Calibri" w:eastAsia="Calibri" w:hAnsi="Calibri"/>
-          <w:color w:val="000000"/>
-          <w:sz w:val="20"/>
-          <w:szCs w:val="20"/>
-        </w:rPr>
-        <w:t xml:space="preserve"> – Bahria University, Karachi</w:t>
-      </w:r>
-      <w:r>
-        <w:t xml:space="preserve">	</w:t>
-      </w:r>
-      <w:r>
-        <w:rPr>
-          <w:rFonts w:ascii="Calibri" w:cs="Calibri" w:eastAsia="Calibri" w:hAnsi="Calibri"/>
-          <w:b/>
-          <w:bCs/>
-          <w:color w:val="000000"/>
-          <w:sz w:val="20"/>
-          <w:szCs w:val="20"/>
-        </w:rPr>
-        <w:t xml:space="preserve">02/2015 – 01/2019</w:t>
-      </w:r>
-    </w:p>
-    <w:p>
-      <w:pPr>
-        <w:spacing w:after="0" w:before="100"/>
-      </w:pPr>
-      <w:r>
-        <w:rPr>
-          <w:rFonts w:ascii="Calibri" w:cs="Calibri" w:eastAsia="Calibri" w:hAnsi="Calibri"/>
-          <w:sz w:val="20"/>
-          <w:szCs w:val="20"/>
-        </w:rPr>
-        <w:t xml:space="preserve"/>
-      </w:r>
-    </w:p>
-    <w:p>
-      <w:pPr>
-        <w:keepNext/>
-        <w:pBdr>
-          <w:bottom w:val="single" w:color="1A5276" w:sz="4" w:space="1"/>
-        </w:pBdr>
-        <w:spacing w:after="0" w:before="120"/>
-      </w:pPr>
-      <w:r>
-        <w:rPr>
-          <w:rFonts w:ascii="Calibri" w:cs="Calibri" w:eastAsia="Calibri" w:hAnsi="Calibri"/>
-          <w:b/>
-          <w:bCs/>
-          <w:caps/>
-          <w:color w:val="2F5496"/>
-          <w:sz w:val="26"/>
-          <w:szCs w:val="26"/>
-        </w:rPr>
-        <w:t xml:space="preserve">Notable Projects</w:t>
-      </w:r>
-    </w:p>
-    <w:p>
-      <w:pPr>
-        <w:keepNext/>
-        <w:spacing w:after="20" w:before="100"/>
-      </w:pPr>
-      <w:hyperlink w:history="1" r:id="rId21ym5acj-sso776orizxp">
-        <w:r>
-          <w:rPr>
-            <w:rFonts w:ascii="Calibri" w:cs="Calibri" w:eastAsia="Calibri" w:hAnsi="Calibri"/>
-            <w:b/>
-            <w:bCs/>
-            <w:color w:val="2E75B6"/>
-            <w:sz w:val="20"/>
-            <w:szCs w:val="20"/>
-            <w:u w:val="single"/>
-          </w:rPr>
-          <w:t xml:space="preserve">GlobalPost Multi-Leg Shipping Consolidator</w:t>
-        </w:r>
-      </w:hyperlink>
+        <w:t xml:space="preserve">JobVault – AI-Assisted Job Application Platform</w:t>
+      </w:r>
+    </w:p>
+    <w:p>
+      <w:pPr>
+        <w:keepNext/>
+        <w:spacing w:after="20" w:before="0"/>
+      </w:pPr>
+      <w:r>
+        <w:rPr>
+          <w:rFonts w:ascii="Calibri" w:cs="Calibri" w:eastAsia="Calibri" w:hAnsi="Calibri"/>
+          <w:i/>
+          <w:iCs/>
+          <w:color w:val="333333"/>
+          <w:sz w:val="18"/>
+          <w:szCs w:val="18"/>
+        </w:rPr>
+        <w:t xml:space="preserve">.NET 9 • Vue 3 • MongoDB • RabbitMQ • Docker • GitHub Actions</w:t>
+      </w:r>
     </w:p>
     <w:p>
       <w:pPr>
@@ -1099,28 +843,8 @@
           <w:sz w:val="20"/>
           <w:szCs w:val="20"/>
         </w:rPr>
-        <w:t xml:space="preserve">Architected and built the full REST API suite on .NET 8 microservices processing 3B+ annual orders across multi-carrier flows (USPS, DHL, DPD, UPS, FedEx), serving 3M+ active shippers</w:t>
-      </w:r>
-    </w:p>
-    <w:p>
-      <w:pPr>
-        <w:keepNext/>
-        <w:spacing w:after="20" w:before="100"/>
-      </w:pPr>
-      <w:hyperlink w:history="1" r:id="rIdgwo5nfxp2nzqxw9rgkiyt">
-        <w:r>
-          <w:rPr>
-            <w:rFonts w:ascii="Calibri" w:cs="Calibri" w:eastAsia="Calibri" w:hAnsi="Calibri"/>
-            <w:b/>
-            <w:bCs/>
-            <w:color w:val="2E75B6"/>
-            <w:sz w:val="20"/>
-            <w:szCs w:val="20"/>
-            <w:u w:val="single"/>
-          </w:rPr>
-          <w:t xml:space="preserve">GlobalPost Shipment Tracking System</w:t>
-        </w:r>
-      </w:hyperlink>
+        <w:t xml:space="preserve">Built an end-to-end platform that evaluates job descriptions against a curated evidence library and generates tailored application documents using AI-assisted workflows</w:t>
+      </w:r>
     </w:p>
     <w:p>
       <w:pPr>
@@ -1138,28 +862,42 @@
           <w:sz w:val="20"/>
           <w:szCs w:val="20"/>
         </w:rPr>
-        <w:t xml:space="preserve">High-throughput tracking engine handling millions of daily transactions, leveraging Redis caching, DynamoDB, and multi-source data aggregation</w:t>
-      </w:r>
-    </w:p>
-    <w:p>
-      <w:pPr>
-        <w:keepNext/>
-        <w:spacing w:after="20" w:before="100"/>
-      </w:pPr>
-      <w:hyperlink w:history="1" r:id="rIdbh5hwyeo7qfq-mztv_nlv">
-        <w:r>
-          <w:rPr>
-            <w:rFonts w:ascii="Calibri" w:cs="Calibri" w:eastAsia="Calibri" w:hAnsi="Calibri"/>
-            <w:b/>
-            <w:bCs/>
-            <w:color w:val="2E75B6"/>
-            <w:sz w:val="20"/>
-            <w:szCs w:val="20"/>
-            <w:u w:val="single"/>
-          </w:rPr>
-          <w:t xml:space="preserve">GlobalPost Admin &amp; Shipper Portals</w:t>
-        </w:r>
-      </w:hyperlink>
+        <w:t xml:space="preserve">Designed an event-driven processing pipeline with RabbitMQ and background workers, with containerized deployment and automated CI/CD; planned for public open-source release</w:t>
+      </w:r>
+    </w:p>
+    <w:p>
+      <w:pPr>
+        <w:keepNext/>
+        <w:spacing w:after="0" w:before="100"/>
+      </w:pPr>
+      <w:r>
+        <w:rPr>
+          <w:rFonts w:ascii="Calibri" w:cs="Calibri" w:eastAsia="Calibri" w:hAnsi="Calibri"/>
+          <w:b/>
+          <w:bCs/>
+          <w:color w:val="2E75B6"/>
+          <w:sz w:val="20"/>
+          <w:szCs w:val="20"/>
+        </w:rPr>
+        <w:t xml:space="preserve">Demand Forecasting System</w:t>
+      </w:r>
+    </w:p>
+    <w:p>
+      <w:pPr>
+        <w:keepNext/>
+        <w:spacing w:after="20" w:before="0"/>
+      </w:pPr>
+      <w:r>
+        <w:rPr>
+          <w:rFonts w:ascii="Calibri" w:cs="Calibri" w:eastAsia="Calibri" w:hAnsi="Calibri"/>
+          <w:i/>
+          <w:iCs/>
+          <w:color w:val="333333"/>
+          <w:sz w:val="18"/>
+          <w:szCs w:val="18"/>
+        </w:rPr>
+        <w:t xml:space="preserve">Python · Machine Learning · Forecasting</w:t>
+      </w:r>
     </w:p>
     <w:p>
       <w:pPr>
@@ -1177,7 +915,241 @@
           <w:sz w:val="20"/>
           <w:szCs w:val="20"/>
         </w:rPr>
-        <w:t xml:space="preserve">Developed with React.js + .NET 8, serving 3M+ internal shippers with JWT-secured, role-based access control</w:t>
+        <w:t xml:space="preserve">Developing a demand-forecasting solution using historical datasets, including external training data, to train and evaluate predictive models for future demand</w:t>
+      </w:r>
+    </w:p>
+    <w:p>
+      <w:pPr>
+        <w:spacing w:after="0" w:before="100"/>
+      </w:pPr>
+      <w:r>
+        <w:rPr>
+          <w:rFonts w:ascii="Calibri" w:cs="Calibri" w:eastAsia="Calibri" w:hAnsi="Calibri"/>
+          <w:sz w:val="20"/>
+          <w:szCs w:val="20"/>
+        </w:rPr>
+        <w:t xml:space="preserve"/>
+      </w:r>
+    </w:p>
+    <w:p>
+      <w:pPr>
+        <w:keepNext/>
+        <w:pBdr>
+          <w:bottom w:val="single" w:color="1A5276" w:sz="4" w:space="1"/>
+        </w:pBdr>
+        <w:spacing w:after="0" w:before="120"/>
+      </w:pPr>
+      <w:r>
+        <w:rPr>
+          <w:rFonts w:ascii="Calibri" w:cs="Calibri" w:eastAsia="Calibri" w:hAnsi="Calibri"/>
+          <w:b/>
+          <w:bCs/>
+          <w:caps/>
+          <w:color w:val="2F5496"/>
+          <w:sz w:val="26"/>
+          <w:szCs w:val="26"/>
+        </w:rPr>
+        <w:t xml:space="preserve">Additional Employment</w:t>
+      </w:r>
+    </w:p>
+    <w:p>
+      <w:pPr>
+        <w:keepNext/>
+        <w:tabs>
+          <w:tab w:val="right" w:pos="10772"/>
+        </w:tabs>
+        <w:spacing w:after="0" w:before="140"/>
+      </w:pPr>
+      <w:r>
+        <w:rPr>
+          <w:rFonts w:ascii="Calibri" w:cs="Calibri" w:eastAsia="Calibri" w:hAnsi="Calibri"/>
+          <w:b/>
+          <w:bCs/>
+          <w:color w:val="2E75B6"/>
+          <w:sz w:val="20"/>
+          <w:szCs w:val="20"/>
+        </w:rPr>
+        <w:t xml:space="preserve">Part-Time Employee</w:t>
+      </w:r>
+      <w:r>
+        <w:t xml:space="preserve">	</w:t>
+      </w:r>
+      <w:r>
+        <w:rPr>
+          <w:rFonts w:ascii="Calibri" w:cs="Calibri" w:eastAsia="Calibri" w:hAnsi="Calibri"/>
+          <w:b/>
+          <w:bCs/>
+          <w:color w:val="000000"/>
+          <w:sz w:val="20"/>
+          <w:szCs w:val="20"/>
+        </w:rPr>
+        <w:t xml:space="preserve">04/2025 – Present</w:t>
+      </w:r>
+    </w:p>
+    <w:p>
+      <w:pPr>
+        <w:keepNext/>
+        <w:spacing w:after="60" w:before="0"/>
+      </w:pPr>
+      <w:r>
+        <w:rPr>
+          <w:rFonts w:ascii="Calibri" w:cs="Calibri" w:eastAsia="Calibri" w:hAnsi="Calibri"/>
+          <w:b/>
+          <w:bCs/>
+          <w:color w:val="000000"/>
+          <w:sz w:val="20"/>
+          <w:szCs w:val="20"/>
+        </w:rPr>
+        <w:t xml:space="preserve">MyLogistics GmbH</w:t>
+      </w:r>
+      <w:r>
+        <w:rPr>
+          <w:rFonts w:ascii="Calibri" w:cs="Calibri" w:eastAsia="Calibri" w:hAnsi="Calibri"/>
+          <w:color w:val="000000"/>
+          <w:sz w:val="20"/>
+          <w:szCs w:val="20"/>
+        </w:rPr>
+        <w:t xml:space="preserve">  –  Raunheim, Germany</w:t>
+      </w:r>
+    </w:p>
+    <w:p>
+      <w:pPr>
+        <w:spacing w:after="0" w:before="100"/>
+      </w:pPr>
+      <w:r>
+        <w:rPr>
+          <w:rFonts w:ascii="Calibri" w:cs="Calibri" w:eastAsia="Calibri" w:hAnsi="Calibri"/>
+          <w:sz w:val="20"/>
+          <w:szCs w:val="20"/>
+        </w:rPr>
+        <w:t xml:space="preserve"/>
+      </w:r>
+    </w:p>
+    <w:p>
+      <w:pPr>
+        <w:keepNext/>
+        <w:pBdr>
+          <w:bottom w:val="single" w:color="1A5276" w:sz="4" w:space="1"/>
+        </w:pBdr>
+        <w:spacing w:after="0" w:before="120"/>
+      </w:pPr>
+      <w:r>
+        <w:rPr>
+          <w:rFonts w:ascii="Calibri" w:cs="Calibri" w:eastAsia="Calibri" w:hAnsi="Calibri"/>
+          <w:b/>
+          <w:bCs/>
+          <w:caps/>
+          <w:color w:val="2F5496"/>
+          <w:sz w:val="26"/>
+          <w:szCs w:val="26"/>
+        </w:rPr>
+        <w:t xml:space="preserve">Education</w:t>
+      </w:r>
+    </w:p>
+    <w:p>
+      <w:pPr>
+        <w:tabs>
+          <w:tab w:val="right" w:pos="10772"/>
+        </w:tabs>
+        <w:spacing w:after="20" w:before="60"/>
+      </w:pPr>
+      <w:r>
+        <w:rPr>
+          <w:rFonts w:ascii="Calibri" w:cs="Calibri" w:eastAsia="Calibri" w:hAnsi="Calibri"/>
+          <w:b/>
+          <w:bCs/>
+          <w:color w:val="2E75B6"/>
+          <w:sz w:val="20"/>
+          <w:szCs w:val="20"/>
+        </w:rPr>
+        <w:t xml:space="preserve">MSCS in </w:t>
+      </w:r>
+      <w:r>
+        <w:rPr>
+          <w:rFonts w:ascii="Calibri" w:cs="Calibri" w:eastAsia="Calibri" w:hAnsi="Calibri"/>
+          <w:b/>
+          <w:bCs/>
+          <w:color w:val="2E75B6"/>
+          <w:sz w:val="20"/>
+          <w:szCs w:val="20"/>
+        </w:rPr>
+        <w:t xml:space="preserve">Computer Science</w:t>
+      </w:r>
+      <w:r>
+        <w:rPr>
+          <w:rFonts w:ascii="Calibri" w:cs="Calibri" w:eastAsia="Calibri" w:hAnsi="Calibri"/>
+          <w:color w:val="000000"/>
+          <w:sz w:val="20"/>
+          <w:szCs w:val="20"/>
+        </w:rPr>
+        <w:t xml:space="preserve"> – Bahria University, Karachi</w:t>
+      </w:r>
+      <w:r>
+        <w:t xml:space="preserve">	</w:t>
+      </w:r>
+      <w:r>
+        <w:rPr>
+          <w:rFonts w:ascii="Calibri" w:cs="Calibri" w:eastAsia="Calibri" w:hAnsi="Calibri"/>
+          <w:b/>
+          <w:bCs/>
+          <w:color w:val="000000"/>
+          <w:sz w:val="20"/>
+          <w:szCs w:val="20"/>
+        </w:rPr>
+        <w:t xml:space="preserve">03/2021 – 01/2023</w:t>
+      </w:r>
+    </w:p>
+    <w:p>
+      <w:pPr>
+        <w:tabs>
+          <w:tab w:val="right" w:pos="10772"/>
+        </w:tabs>
+        <w:spacing w:after="20" w:before="60"/>
+      </w:pPr>
+      <w:r>
+        <w:rPr>
+          <w:rFonts w:ascii="Calibri" w:cs="Calibri" w:eastAsia="Calibri" w:hAnsi="Calibri"/>
+          <w:b/>
+          <w:bCs/>
+          <w:color w:val="2E75B6"/>
+          <w:sz w:val="20"/>
+          <w:szCs w:val="20"/>
+        </w:rPr>
+        <w:t xml:space="preserve">BSCS in </w:t>
+      </w:r>
+      <w:r>
+        <w:rPr>
+          <w:rFonts w:ascii="Calibri" w:cs="Calibri" w:eastAsia="Calibri" w:hAnsi="Calibri"/>
+          <w:b/>
+          <w:bCs/>
+          <w:color w:val="2E75B6"/>
+          <w:sz w:val="20"/>
+          <w:szCs w:val="20"/>
+        </w:rPr>
+        <w:t xml:space="preserve">Computer Science</w:t>
+      </w:r>
+      <w:r>
+        <w:rPr>
+          <w:rFonts w:ascii="Calibri" w:cs="Calibri" w:eastAsia="Calibri" w:hAnsi="Calibri"/>
+          <w:color w:val="000000"/>
+          <w:sz w:val="20"/>
+          <w:szCs w:val="20"/>
+        </w:rPr>
+        <w:t xml:space="preserve"> – Bahria University, Karachi</w:t>
+      </w:r>
+      <w:r>
+        <w:t xml:space="preserve">	</w:t>
+      </w:r>
+      <w:r>
+        <w:rPr>
+          <w:rFonts w:ascii="Calibri" w:cs="Calibri" w:eastAsia="Calibri" w:hAnsi="Calibri"/>
+          <w:b/>
+          <w:bCs/>
+          <w:color w:val="000000"/>
+          <w:sz w:val="20"/>
+          <w:szCs w:val="20"/>
+        </w:rPr>
+        <w:t xml:space="preserve">02/2015 – 01/2019</w:t>
       </w:r>
     </w:p>
     <w:p>
@@ -1249,7 +1221,7 @@
           <w:sz w:val="20"/>
           <w:szCs w:val="20"/>
         </w:rPr>
-        <w:t xml:space="preserve">Represented Bari’s Technology Solutions at GITEX GLOBAL 2023, Dubai – resulting in 5 qualified leads</w:t>
+        <w:t xml:space="preserve">Represented Bari’s Technology Solutions at GITEX GLOBAL 2023, Dubai</w:t>
       </w:r>
     </w:p>
     <w:p>
@@ -1268,7 +1240,7 @@
           <w:sz w:val="20"/>
           <w:szCs w:val="20"/>
         </w:rPr>
-        <w:t xml:space="preserve">Recognised as ‘Reliability Maestro’ for delivering 100% on time and resolving critical issues under pressure</w:t>
+        <w:t xml:space="preserve">Recognised internally as “Reliability Maestro” for dependable delivery and resolving critical issues under pressure</w:t>
       </w:r>
     </w:p>
     <w:p>
@@ -1321,7 +1293,7 @@
           <w:sz w:val="20"/>
           <w:szCs w:val="20"/>
         </w:rPr>
-        <w:t xml:space="preserve">English – C1 Advanced (IELTS 7.0)</w:t>
+        <w:t xml:space="preserve">English – C1 Advanced (IELTS)</w:t>
       </w:r>
     </w:p>
     <w:p>

</xml_diff>